<commit_message>
updates as per comments based  from Cloud Hire..
</commit_message>
<xml_diff>
--- a/Resume_07_09.docx
+++ b/Resume_07_09.docx
@@ -4,6 +4,7 @@
   <w:body>
     <w:p>
       <w:pPr>
+        <w:spacing w:line="240" w:lineRule="auto"/>
         <w:rPr>
           <w:b/>
           <w:bCs/>
@@ -25,6 +26,7 @@
     </w:p>
     <w:p>
       <w:pPr>
+        <w:spacing w:line="240" w:lineRule="auto"/>
         <w:rPr>
           <w:b/>
           <w:bCs/>
@@ -41,133 +43,12 @@
           <w:sz w:val="20"/>
           <w:szCs w:val="20"/>
         </w:rPr>
-        <w:t xml:space="preserve">Technical </w:t>
-      </w:r>
-      <w:r>
-        <w:rPr>
-          <w:b/>
-          <w:bCs/>
-          <w:color w:val="0070C0"/>
-          <w:sz w:val="20"/>
-          <w:szCs w:val="20"/>
-        </w:rPr>
-        <w:t xml:space="preserve">Leadership </w:t>
-      </w:r>
-      <w:r>
-        <w:rPr>
-          <w:b/>
-          <w:bCs/>
-          <w:color w:val="0070C0"/>
-          <w:sz w:val="20"/>
-          <w:szCs w:val="20"/>
-        </w:rPr>
-        <w:t>| Solution Architecture</w:t>
-      </w:r>
-      <w:r>
-        <w:rPr>
-          <w:b/>
-          <w:bCs/>
-          <w:color w:val="0070C0"/>
-          <w:sz w:val="20"/>
-          <w:szCs w:val="20"/>
-        </w:rPr>
-        <w:t xml:space="preserve"> | </w:t>
-      </w:r>
-      <w:r>
-        <w:rPr>
-          <w:b/>
-          <w:bCs/>
-          <w:color w:val="0070C0"/>
-          <w:sz w:val="20"/>
-          <w:szCs w:val="20"/>
-        </w:rPr>
-        <w:t>Platform Modernization</w:t>
-      </w:r>
-      <w:r>
-        <w:rPr>
-          <w:b/>
-          <w:bCs/>
-          <w:color w:val="0070C0"/>
-          <w:sz w:val="20"/>
-          <w:szCs w:val="20"/>
-        </w:rPr>
-        <w:t xml:space="preserve"> |</w:t>
-      </w:r>
-      <w:r>
-        <w:rPr>
-          <w:b/>
-          <w:bCs/>
-          <w:color w:val="0070C0"/>
-          <w:sz w:val="20"/>
-          <w:szCs w:val="20"/>
-        </w:rPr>
-        <w:t xml:space="preserve"> .Net &amp;</w:t>
-      </w:r>
-      <w:r>
-        <w:rPr>
-          <w:b/>
-          <w:bCs/>
-          <w:color w:val="0070C0"/>
-          <w:sz w:val="20"/>
-          <w:szCs w:val="20"/>
-        </w:rPr>
-        <w:t xml:space="preserve"> Azure Cloud | Distributed Systems </w:t>
-      </w:r>
-      <w:r>
-        <w:rPr>
-          <w:b/>
-          <w:bCs/>
-          <w:color w:val="0070C0"/>
-          <w:sz w:val="20"/>
-          <w:szCs w:val="20"/>
-        </w:rPr>
-        <w:t xml:space="preserve">| </w:t>
-      </w:r>
-      <w:r>
-        <w:rPr>
-          <w:b/>
-          <w:bCs/>
-          <w:color w:val="0070C0"/>
-          <w:sz w:val="20"/>
-          <w:szCs w:val="20"/>
-        </w:rPr>
-        <w:t>SRE</w:t>
-      </w:r>
-      <w:r>
-        <w:rPr>
-          <w:b/>
-          <w:bCs/>
-          <w:color w:val="0070C0"/>
-          <w:sz w:val="20"/>
-          <w:szCs w:val="20"/>
-        </w:rPr>
-        <w:t xml:space="preserve"> | </w:t>
-      </w:r>
-      <w:proofErr w:type="spellStart"/>
-      <w:r>
-        <w:rPr>
-          <w:b/>
-          <w:bCs/>
-          <w:color w:val="0070C0"/>
-          <w:sz w:val="20"/>
-          <w:szCs w:val="20"/>
-        </w:rPr>
-        <w:t>SAFe</w:t>
-      </w:r>
-      <w:proofErr w:type="spellEnd"/>
-      <w:r>
-        <w:rPr>
-          <w:b/>
-          <w:bCs/>
-          <w:color w:val="0070C0"/>
-          <w:sz w:val="20"/>
-          <w:szCs w:val="20"/>
-        </w:rPr>
-        <w:t xml:space="preserve"> Scrum Master</w:t>
-      </w:r>
-    </w:p>
-    <w:p>
-      <w:pPr>
+        <w:t>TECHNICAL LEAD | ENGINEERING MANAGER-LEVEL LEADERSHIP | SOLUTION ARCHITECTURE</w:t>
+      </w:r>
+    </w:p>
+    <w:p>
+      <w:pPr>
+        <w:spacing w:line="240" w:lineRule="auto"/>
         <w:rPr>
           <w:sz w:val="20"/>
           <w:szCs w:val="20"/>
@@ -327,7 +208,21 @@
           <w:sz w:val="20"/>
           <w:szCs w:val="20"/>
         </w:rPr>
-        <w:t>Technical Lead with experience performing Technical Manager responsibilities while remaining hands-on in software engineering and solution architecture. Experienced in leading engineering teams, providing technical and architectural direction, and designing, developing, and modernizing enterprise-scale applications. Strong hands-on expertise in .NET, Azure Cloud, Distributed Systems, Event-Driven Architecture, API Architecture, Enterprise Integration, SRE, DevOps, Observability, and Cloud Migration. Proven ability to bridge engineering leadership and architecture by mentoring teams, driving technical decisions, modernizing legacy platforms, resolving complex technical challenges, and delivering scalable, secure, and highly available enterprise solutions.</w:t>
+        <w:t>Technical Lead with 16+ years of experience delivering enterprise software solutions, currently performing Engineering Manager-level responsibilities while remaining hands-on in technical leadership and solution architecture. Experienced in leading cross-functional engineering teams, owning delivery and release execution, driving technical strategy and engineering governance, mentoring engineers, and partnering with business and technology stakeholders. Strong background in enterprise architecture, distributed systems, platform modernization, .NET, Azure, enterprise integration, event-driven architecture, SRE, DevOps, and production reliability. Proven outcomes include a zero-downtime migration of 100M+ metadata records, contribution to Azure modernization across 30 enterprise applications, and ownership of a platform supporting approximately 2</w:t>
+      </w:r>
+      <w:r>
+        <w:rPr>
+          <w:sz w:val="20"/>
+          <w:szCs w:val="20"/>
+        </w:rPr>
+        <w:t>0</w:t>
+      </w:r>
+      <w:r>
+        <w:rPr>
+          <w:sz w:val="20"/>
+          <w:szCs w:val="20"/>
+        </w:rPr>
+        <w:t>,000 orders per day at 99.9% availability.</w:t>
       </w:r>
       <w:r>
         <w:rPr>
@@ -341,13 +236,7 @@
     </w:p>
     <w:p>
       <w:pPr>
-        <w:spacing w:line="240" w:lineRule="auto"/>
-        <w:rPr>
-          <w:sz w:val="20"/>
-          <w:szCs w:val="20"/>
-        </w:rPr>
-      </w:pPr>
-      <w:r>
+        <w:jc w:val="both"/>
         <w:rPr>
           <w:b/>
           <w:bCs/>
@@ -355,16 +244,25 @@
           <w:sz w:val="20"/>
           <w:szCs w:val="20"/>
         </w:rPr>
-        <w:t>EXECUTIVE HIGHLIGHTS</w:t>
-      </w:r>
-    </w:p>
-    <w:p>
-      <w:pPr>
+      </w:pPr>
+      <w:r>
+        <w:rPr>
+          <w:b/>
+          <w:bCs/>
+          <w:color w:val="0070C0"/>
+          <w:sz w:val="20"/>
+          <w:szCs w:val="20"/>
+        </w:rPr>
+        <w:t>LEADERSHIP &amp; ARCHITECTURE IMPACT</w:t>
+      </w:r>
+    </w:p>
+    <w:p>
+      <w:pPr>
+        <w:pStyle w:val="ListParagraph"/>
         <w:numPr>
           <w:ilvl w:val="0"/>
-          <w:numId w:val="3"/>
+          <w:numId w:val="6"/>
         </w:numPr>
-        <w:spacing w:line="240" w:lineRule="auto"/>
         <w:jc w:val="both"/>
         <w:rPr>
           <w:sz w:val="20"/>
@@ -373,33 +271,28 @@
       </w:pPr>
       <w:r>
         <w:rPr>
-          <w:sz w:val="20"/>
-          <w:szCs w:val="20"/>
-        </w:rPr>
-        <w:t>16</w:t>
-      </w:r>
-      <w:r>
-        <w:rPr>
-          <w:sz w:val="20"/>
-          <w:szCs w:val="20"/>
-        </w:rPr>
-        <w:t>+ years</w:t>
-      </w:r>
-      <w:r>
-        <w:rPr>
-          <w:sz w:val="20"/>
-          <w:szCs w:val="20"/>
-        </w:rPr>
-        <w:t xml:space="preserve"> of experience delivering enterprise software solutions using Microsoft technologies.</w:t>
-      </w:r>
-    </w:p>
-    <w:p>
-      <w:pPr>
+          <w:b/>
+          <w:bCs/>
+          <w:sz w:val="20"/>
+          <w:szCs w:val="20"/>
+        </w:rPr>
+        <w:t>Lead</w:t>
+      </w:r>
+      <w:r>
+        <w:rPr>
+          <w:sz w:val="20"/>
+          <w:szCs w:val="20"/>
+        </w:rPr>
+        <w:t xml:space="preserve"> a 10-member cross-functional Agile engineering team, with responsibility for technical execution, delivery planning, mentoring, code quality, engineering governance, and production support. </w:t>
+      </w:r>
+    </w:p>
+    <w:p>
+      <w:pPr>
+        <w:pStyle w:val="ListParagraph"/>
         <w:numPr>
           <w:ilvl w:val="0"/>
-          <w:numId w:val="3"/>
+          <w:numId w:val="6"/>
         </w:numPr>
-        <w:spacing w:line="240" w:lineRule="auto"/>
         <w:jc w:val="both"/>
         <w:rPr>
           <w:sz w:val="20"/>
@@ -408,40 +301,28 @@
       </w:pPr>
       <w:r>
         <w:rPr>
-          <w:sz w:val="20"/>
-          <w:szCs w:val="20"/>
-        </w:rPr>
-        <w:t>Engineering Manager-level responsibilities</w:t>
-      </w:r>
-      <w:r>
-        <w:rPr>
-          <w:sz w:val="20"/>
-          <w:szCs w:val="20"/>
-        </w:rPr>
-        <w:t xml:space="preserve"> leading Agile software delivery for a global distributed platform across </w:t>
-      </w:r>
-      <w:r>
-        <w:rPr>
-          <w:sz w:val="20"/>
-          <w:szCs w:val="20"/>
-        </w:rPr>
-        <w:t>US, Europe, Japan, and India</w:t>
-      </w:r>
-      <w:r>
-        <w:rPr>
-          <w:sz w:val="20"/>
-          <w:szCs w:val="20"/>
-        </w:rPr>
-        <w:t>.</w:t>
-      </w:r>
-    </w:p>
-    <w:p>
-      <w:pPr>
+          <w:b/>
+          <w:bCs/>
+          <w:sz w:val="20"/>
+          <w:szCs w:val="20"/>
+        </w:rPr>
+        <w:t>Drive</w:t>
+      </w:r>
+      <w:r>
+        <w:rPr>
+          <w:sz w:val="20"/>
+          <w:szCs w:val="20"/>
+        </w:rPr>
+        <w:t xml:space="preserve"> technical strategy and solution design across distributed Azure applications, APIs, event-driven services, and enterprise integrations, balancing scalability, reliability, security, and delivery priorities. </w:t>
+      </w:r>
+    </w:p>
+    <w:p>
+      <w:pPr>
+        <w:pStyle w:val="ListParagraph"/>
         <w:numPr>
           <w:ilvl w:val="0"/>
-          <w:numId w:val="3"/>
+          <w:numId w:val="6"/>
         </w:numPr>
-        <w:spacing w:line="240" w:lineRule="auto"/>
         <w:jc w:val="both"/>
         <w:rPr>
           <w:sz w:val="20"/>
@@ -450,19 +331,28 @@
       </w:pPr>
       <w:r>
         <w:rPr>
-          <w:sz w:val="20"/>
-          <w:szCs w:val="20"/>
-        </w:rPr>
-        <w:t>Managed cross-functional engineering teams responsible for architecture, software development, code quality, release management, production support, and continuous improvement.</w:t>
-      </w:r>
-    </w:p>
-    <w:p>
-      <w:pPr>
+          <w:b/>
+          <w:bCs/>
+          <w:sz w:val="20"/>
+          <w:szCs w:val="20"/>
+        </w:rPr>
+        <w:t>Own and execute</w:t>
+      </w:r>
+      <w:r>
+        <w:rPr>
+          <w:sz w:val="20"/>
+          <w:szCs w:val="20"/>
+        </w:rPr>
+        <w:t xml:space="preserve"> the migration of 100M+ metadata records from Elasticsearch to MongoDB with zero production downtime, improving scalability and reducing infrastructure costs. </w:t>
+      </w:r>
+    </w:p>
+    <w:p>
+      <w:pPr>
+        <w:pStyle w:val="ListParagraph"/>
         <w:numPr>
           <w:ilvl w:val="0"/>
-          <w:numId w:val="3"/>
+          <w:numId w:val="6"/>
         </w:numPr>
-        <w:spacing w:line="240" w:lineRule="auto"/>
         <w:jc w:val="both"/>
         <w:rPr>
           <w:sz w:val="20"/>
@@ -471,33 +361,28 @@
       </w:pPr>
       <w:r>
         <w:rPr>
-          <w:sz w:val="20"/>
-          <w:szCs w:val="20"/>
-        </w:rPr>
-        <w:t xml:space="preserve">Established the organization's </w:t>
-      </w:r>
-      <w:r>
-        <w:rPr>
-          <w:sz w:val="20"/>
-          <w:szCs w:val="20"/>
-        </w:rPr>
-        <w:t>Site Reliability Engineering (SRE)</w:t>
-      </w:r>
-      <w:r>
-        <w:rPr>
-          <w:sz w:val="20"/>
-          <w:szCs w:val="20"/>
-        </w:rPr>
-        <w:t xml:space="preserve"> practice, introducing SLI/SLO governance, observability, Root Cause Analysis (RCA), and engineering reliability standards.</w:t>
-      </w:r>
-    </w:p>
-    <w:p>
-      <w:pPr>
+          <w:b/>
+          <w:bCs/>
+          <w:sz w:val="20"/>
+          <w:szCs w:val="20"/>
+        </w:rPr>
+        <w:t>Drive</w:t>
+      </w:r>
+      <w:r>
+        <w:rPr>
+          <w:sz w:val="20"/>
+          <w:szCs w:val="20"/>
+        </w:rPr>
+        <w:t xml:space="preserve"> modernization initiatives across 30 enterprise applications to Microsoft Azure, including secure cross-tenant integration using Private Endpoints, Managed Identity, Key Vault, and Azure networking. </w:t>
+      </w:r>
+    </w:p>
+    <w:p>
+      <w:pPr>
+        <w:pStyle w:val="ListParagraph"/>
         <w:numPr>
           <w:ilvl w:val="0"/>
-          <w:numId w:val="3"/>
+          <w:numId w:val="6"/>
         </w:numPr>
-        <w:spacing w:line="240" w:lineRule="auto"/>
         <w:jc w:val="both"/>
         <w:rPr>
           <w:sz w:val="20"/>
@@ -506,33 +391,28 @@
       </w:pPr>
       <w:r>
         <w:rPr>
-          <w:sz w:val="20"/>
-          <w:szCs w:val="20"/>
-        </w:rPr>
-        <w:t xml:space="preserve">Led a </w:t>
-      </w:r>
-      <w:r>
-        <w:rPr>
-          <w:sz w:val="20"/>
-          <w:szCs w:val="20"/>
-        </w:rPr>
-        <w:t>zero-downtime migration of over 100 million metadata records</w:t>
-      </w:r>
-      <w:r>
-        <w:rPr>
-          <w:sz w:val="20"/>
-          <w:szCs w:val="20"/>
-        </w:rPr>
-        <w:t xml:space="preserve"> from Elasticsearch to MongoDB through a configurable platform architecture, significantly reducing infrastructure costs.</w:t>
-      </w:r>
-    </w:p>
-    <w:p>
-      <w:pPr>
+          <w:b/>
+          <w:bCs/>
+          <w:sz w:val="20"/>
+          <w:szCs w:val="20"/>
+        </w:rPr>
+        <w:t>Establish and govern</w:t>
+      </w:r>
+      <w:r>
+        <w:rPr>
+          <w:sz w:val="20"/>
+          <w:szCs w:val="20"/>
+        </w:rPr>
+        <w:t xml:space="preserve"> SRE practices covering SLI/SLO/SLA governance, observability, incident management, dashboards, and structured Root Cause Analysis. </w:t>
+      </w:r>
+    </w:p>
+    <w:p>
+      <w:pPr>
+        <w:pStyle w:val="ListParagraph"/>
         <w:numPr>
           <w:ilvl w:val="0"/>
-          <w:numId w:val="3"/>
+          <w:numId w:val="6"/>
         </w:numPr>
-        <w:spacing w:line="240" w:lineRule="auto"/>
         <w:jc w:val="both"/>
         <w:rPr>
           <w:sz w:val="20"/>
@@ -541,33 +421,42 @@
       </w:pPr>
       <w:r>
         <w:rPr>
-          <w:sz w:val="20"/>
-          <w:szCs w:val="20"/>
-        </w:rPr>
-        <w:t xml:space="preserve">Contributed to the migration of </w:t>
-      </w:r>
-      <w:r>
-        <w:rPr>
-          <w:sz w:val="20"/>
-          <w:szCs w:val="20"/>
-        </w:rPr>
-        <w:t>30 enterprise applications</w:t>
-      </w:r>
-      <w:r>
-        <w:rPr>
-          <w:sz w:val="20"/>
-          <w:szCs w:val="20"/>
-        </w:rPr>
-        <w:t xml:space="preserve"> to Microsoft Azure as part of enterprise cloud modernization initiatives.</w:t>
-      </w:r>
-    </w:p>
-    <w:p>
-      <w:pPr>
+          <w:b/>
+          <w:bCs/>
+          <w:sz w:val="20"/>
+          <w:szCs w:val="20"/>
+        </w:rPr>
+        <w:t>Own</w:t>
+      </w:r>
+      <w:r>
+        <w:rPr>
+          <w:sz w:val="20"/>
+          <w:szCs w:val="20"/>
+        </w:rPr>
+        <w:t xml:space="preserve"> technical reliability and production operations for approximately 2</w:t>
+      </w:r>
+      <w:r>
+        <w:rPr>
+          <w:sz w:val="20"/>
+          <w:szCs w:val="20"/>
+        </w:rPr>
+        <w:t>0</w:t>
+      </w:r>
+      <w:r>
+        <w:rPr>
+          <w:sz w:val="20"/>
+          <w:szCs w:val="20"/>
+        </w:rPr>
+        <w:t xml:space="preserve">,000 orders per day at 99.9% availability, including coordination of Sev-1 incidents and critical production issues. </w:t>
+      </w:r>
+    </w:p>
+    <w:p>
+      <w:pPr>
+        <w:pStyle w:val="ListParagraph"/>
         <w:numPr>
           <w:ilvl w:val="0"/>
-          <w:numId w:val="3"/>
+          <w:numId w:val="6"/>
         </w:numPr>
-        <w:spacing w:line="240" w:lineRule="auto"/>
         <w:jc w:val="both"/>
         <w:rPr>
           <w:sz w:val="20"/>
@@ -576,41 +465,38 @@
       </w:pPr>
       <w:r>
         <w:rPr>
-          <w:sz w:val="20"/>
-          <w:szCs w:val="20"/>
-        </w:rPr>
-        <w:t xml:space="preserve">Designed secure </w:t>
-      </w:r>
-      <w:r>
-        <w:rPr>
-          <w:sz w:val="20"/>
-          <w:szCs w:val="20"/>
-        </w:rPr>
-        <w:t>Azure cross-tenant integration architecture</w:t>
-      </w:r>
-      <w:r>
-        <w:rPr>
-          <w:sz w:val="20"/>
-          <w:szCs w:val="20"/>
-        </w:rPr>
-        <w:t xml:space="preserve"> enabling enterprise-wide reuse of shared platform capabilities.</w:t>
-      </w:r>
-    </w:p>
-    <w:p>
-      <w:pPr>
-        <w:rPr>
-          <w:sz w:val="20"/>
-          <w:szCs w:val="20"/>
-        </w:rPr>
-      </w:pPr>
-      <w:r>
-        <w:pict w14:anchorId="530F6F4E">
+          <w:b/>
+          <w:bCs/>
+          <w:sz w:val="20"/>
+          <w:szCs w:val="20"/>
+        </w:rPr>
+        <w:t>Collaborate</w:t>
+      </w:r>
+      <w:r>
+        <w:rPr>
+          <w:sz w:val="20"/>
+          <w:szCs w:val="20"/>
+        </w:rPr>
+        <w:t xml:space="preserve"> with Product, Architecture, Infrastructure, Security, QA, and SRE stakeholders to translate business priorities into technical solutions and delivery plans.</w:t>
+      </w:r>
+    </w:p>
+    <w:p>
+      <w:pPr>
+        <w:jc w:val="both"/>
+        <w:rPr>
+          <w:sz w:val="20"/>
+          <w:szCs w:val="20"/>
+        </w:rPr>
+      </w:pPr>
+      <w:r>
+        <w:pict w14:anchorId="7FCA8306">
           <v:rect id="_x0000_i1027" style="width:0;height:1.5pt" o:hralign="center" o:hrstd="t" o:hr="t" fillcolor="#a0a0a0" stroked="f"/>
         </w:pict>
       </w:r>
     </w:p>
     <w:p>
       <w:pPr>
+        <w:jc w:val="both"/>
         <w:rPr>
           <w:b/>
           <w:bCs/>
@@ -627,7 +513,37 @@
           <w:sz w:val="20"/>
           <w:szCs w:val="20"/>
         </w:rPr>
-        <w:t>TECHNICAL EXPERTISE</w:t>
+        <w:t>CORE COMPETENCIES</w:t>
+      </w:r>
+    </w:p>
+    <w:p>
+      <w:pPr>
+        <w:pStyle w:val="ListParagraph"/>
+        <w:numPr>
+          <w:ilvl w:val="0"/>
+          <w:numId w:val="7"/>
+        </w:numPr>
+        <w:jc w:val="both"/>
+        <w:rPr>
+          <w:sz w:val="20"/>
+          <w:szCs w:val="20"/>
+        </w:rPr>
+      </w:pPr>
+      <w:r>
+        <w:rPr>
+          <w:b/>
+          <w:bCs/>
+          <w:sz w:val="20"/>
+          <w:szCs w:val="20"/>
+        </w:rPr>
+        <w:t>Engineering Management</w:t>
+      </w:r>
+      <w:r>
+        <w:rPr>
+          <w:sz w:val="20"/>
+          <w:szCs w:val="20"/>
+        </w:rPr>
+        <w:t>: Engineering Delivery, Software Delivery, Technical Leadership, Agile Delivery, SDLC, Release Management, Stakeholder Management, Cross-functional Leadership, Engineering Governance, Mentoring, Incident Management, Risk Management, Continuous Improvement</w:t>
       </w:r>
     </w:p>
     <w:p>
@@ -650,14 +566,14 @@
           <w:sz w:val="20"/>
           <w:szCs w:val="20"/>
         </w:rPr>
-        <w:t>Engineering Management</w:t>
-      </w:r>
-      <w:r>
-        <w:rPr>
-          <w:sz w:val="20"/>
-          <w:szCs w:val="20"/>
-        </w:rPr>
-        <w:t>: Engineering Delivery, Software Delivery, Technical Leadership, Agile Delivery, SDLC, Release Management, Stakeholder Management, Cross-functional Leadership, Engineering Governance, Mentoring, Incident Management, Risk Management, Continuous Improvement</w:t>
+        <w:t>Architecture</w:t>
+      </w:r>
+      <w:r>
+        <w:rPr>
+          <w:sz w:val="20"/>
+          <w:szCs w:val="20"/>
+        </w:rPr>
+        <w:t>: Enterprise Architecture, Software Architecture, Distributed Systems, Event-Driven Architecture, Enterprise Integration, REST APIs, Microservices, Configuration-Driven Design</w:t>
       </w:r>
     </w:p>
     <w:p>
@@ -680,36 +596,6 @@
           <w:sz w:val="20"/>
           <w:szCs w:val="20"/>
         </w:rPr>
-        <w:t>Architecture</w:t>
-      </w:r>
-      <w:r>
-        <w:rPr>
-          <w:sz w:val="20"/>
-          <w:szCs w:val="20"/>
-        </w:rPr>
-        <w:t>: Enterprise Architecture, Software Architecture, Distributed Systems, Event-Driven Architecture, Enterprise Integration, REST APIs, Microservices, Configuration-Driven Design</w:t>
-      </w:r>
-    </w:p>
-    <w:p>
-      <w:pPr>
-        <w:pStyle w:val="ListParagraph"/>
-        <w:numPr>
-          <w:ilvl w:val="0"/>
-          <w:numId w:val="3"/>
-        </w:numPr>
-        <w:jc w:val="both"/>
-        <w:rPr>
-          <w:sz w:val="20"/>
-          <w:szCs w:val="20"/>
-        </w:rPr>
-      </w:pPr>
-      <w:r>
-        <w:rPr>
-          <w:b/>
-          <w:bCs/>
-          <w:sz w:val="20"/>
-          <w:szCs w:val="20"/>
-        </w:rPr>
         <w:t>Cloud &amp; DevOps</w:t>
       </w:r>
       <w:r>
@@ -724,14 +610,7 @@
           <w:sz w:val="20"/>
           <w:szCs w:val="20"/>
         </w:rPr>
-        <w:t xml:space="preserve"> API Management, App </w:t>
-      </w:r>
-      <w:r>
-        <w:rPr>
-          <w:sz w:val="20"/>
-          <w:szCs w:val="20"/>
-        </w:rPr>
-        <w:t>Gateway,</w:t>
+        <w:t xml:space="preserve"> API Management, App Gateway,</w:t>
       </w:r>
       <w:r>
         <w:rPr>
@@ -761,14 +640,7 @@
           <w:sz w:val="20"/>
           <w:szCs w:val="20"/>
         </w:rPr>
-        <w:t xml:space="preserve"> Docker</w:t>
-      </w:r>
-      <w:r>
-        <w:rPr>
-          <w:sz w:val="20"/>
-          <w:szCs w:val="20"/>
-        </w:rPr>
-        <w:t>, Kubernetes.</w:t>
+        <w:t xml:space="preserve"> Docker, Kubernetes.</w:t>
       </w:r>
     </w:p>
     <w:p>
@@ -799,35 +671,14 @@
           <w:sz w:val="20"/>
           <w:szCs w:val="20"/>
         </w:rPr>
-        <w:t xml:space="preserve">: C#, .NET Framework, .NET </w:t>
-      </w:r>
-      <w:r>
-        <w:rPr>
-          <w:sz w:val="20"/>
-          <w:szCs w:val="20"/>
-        </w:rPr>
-        <w:t>Core</w:t>
-      </w:r>
-      <w:r>
-        <w:rPr>
-          <w:sz w:val="20"/>
-          <w:szCs w:val="20"/>
-        </w:rPr>
-        <w:t>,</w:t>
-      </w:r>
-      <w:r>
-        <w:rPr>
-          <w:sz w:val="20"/>
-          <w:szCs w:val="20"/>
-        </w:rPr>
-        <w:t xml:space="preserve"> .N</w:t>
-      </w:r>
-      <w:r>
-        <w:rPr>
-          <w:sz w:val="20"/>
-          <w:szCs w:val="20"/>
-        </w:rPr>
-        <w:t>ET</w:t>
+        <w:t>: C#, .NET Framework, .NET Core</w:t>
+      </w:r>
+      <w:r>
+        <w:rPr>
+          <w:sz w:val="20"/>
+          <w:szCs w:val="20"/>
+        </w:rPr>
+        <w:t>, .NET</w:t>
       </w:r>
       <w:r>
         <w:rPr>
@@ -892,37 +743,23 @@
           <w:sz w:val="20"/>
           <w:szCs w:val="20"/>
         </w:rPr>
+        <w:t xml:space="preserve">, React, </w:t>
+      </w:r>
+      <w:proofErr w:type="spellStart"/>
+      <w:r>
+        <w:rPr>
+          <w:sz w:val="20"/>
+          <w:szCs w:val="20"/>
+        </w:rPr>
+        <w:t>GraphQL</w:t>
+      </w:r>
+      <w:proofErr w:type="spellEnd"/>
+      <w:r>
+        <w:rPr>
+          <w:sz w:val="20"/>
+          <w:szCs w:val="20"/>
+        </w:rPr>
         <w:t xml:space="preserve">, </w:t>
-      </w:r>
-      <w:r>
-        <w:rPr>
-          <w:sz w:val="20"/>
-          <w:szCs w:val="20"/>
-        </w:rPr>
-        <w:t xml:space="preserve">React, </w:t>
-      </w:r>
-      <w:proofErr w:type="spellStart"/>
-      <w:r>
-        <w:rPr>
-          <w:sz w:val="20"/>
-          <w:szCs w:val="20"/>
-        </w:rPr>
-        <w:t>GraphQL</w:t>
-      </w:r>
-      <w:proofErr w:type="spellEnd"/>
-      <w:r>
-        <w:rPr>
-          <w:sz w:val="20"/>
-          <w:szCs w:val="20"/>
-        </w:rPr>
-        <w:t>,</w:t>
-      </w:r>
-      <w:r>
-        <w:rPr>
-          <w:sz w:val="20"/>
-          <w:szCs w:val="20"/>
-        </w:rPr>
-        <w:t xml:space="preserve"> </w:t>
       </w:r>
       <w:proofErr w:type="spellStart"/>
       <w:r>
@@ -993,84 +830,27 @@
           <w:szCs w:val="20"/>
           <w:lang w:val="en-US"/>
         </w:rPr>
-        <w:t xml:space="preserve">AI / LLM </w:t>
-      </w:r>
-      <w:r>
-        <w:rPr>
-          <w:b/>
-          <w:bCs/>
+        <w:t xml:space="preserve">AI / LLM Technologies: </w:t>
+      </w:r>
+      <w:r>
+        <w:rPr>
           <w:sz w:val="20"/>
           <w:szCs w:val="20"/>
           <w:lang w:val="en-US"/>
         </w:rPr>
-        <w:t>Technologies:</w:t>
-      </w:r>
-      <w:r>
-        <w:rPr>
-          <w:b/>
-          <w:bCs/>
-          <w:sz w:val="20"/>
-          <w:szCs w:val="20"/>
-          <w:lang w:val="en-US"/>
-        </w:rPr>
-        <w:t xml:space="preserve"> </w:t>
-      </w:r>
-      <w:r>
-        <w:rPr>
-          <w:sz w:val="20"/>
-          <w:szCs w:val="20"/>
-          <w:lang w:val="en-US"/>
-        </w:rPr>
-        <w:t>Large Language Models (LLMs</w:t>
-      </w:r>
-      <w:r>
-        <w:rPr>
-          <w:sz w:val="20"/>
-          <w:szCs w:val="20"/>
-          <w:lang w:val="en-US"/>
-        </w:rPr>
-        <w:t>),</w:t>
-      </w:r>
-      <w:r>
-        <w:rPr>
-          <w:sz w:val="20"/>
-          <w:szCs w:val="20"/>
-          <w:lang w:val="en-US"/>
-        </w:rPr>
-        <w:t xml:space="preserve"> Prompt Engineering </w:t>
-      </w:r>
-      <w:r>
-        <w:rPr>
-          <w:sz w:val="20"/>
-          <w:szCs w:val="20"/>
-          <w:lang w:val="en-US"/>
-        </w:rPr>
-        <w:t>Techniques,</w:t>
-      </w:r>
-      <w:r>
-        <w:rPr>
-          <w:sz w:val="20"/>
-          <w:szCs w:val="20"/>
-          <w:lang w:val="en-US"/>
-        </w:rPr>
-        <w:t xml:space="preserve"> </w:t>
-      </w:r>
-      <w:r>
-        <w:rPr>
-          <w:sz w:val="20"/>
-          <w:szCs w:val="20"/>
-          <w:lang w:val="en-US"/>
-        </w:rPr>
-        <w:t>Lang Chain</w:t>
-      </w:r>
-      <w:r>
-        <w:rPr>
-          <w:sz w:val="20"/>
-          <w:szCs w:val="20"/>
-          <w:lang w:val="en-US"/>
-        </w:rPr>
-        <w:t xml:space="preserve">, OpenAI API, Embeddings &amp; Vector Search, RAG-based Architectures </w:t>
-      </w:r>
+        <w:t xml:space="preserve">Large Language Models (LLMs), Prompt Engineering Techniques, Lang Chain, OpenAI API, Embeddings &amp; Vector Search, RAG-based Architectures </w:t>
+      </w:r>
+    </w:p>
+    <w:p>
+      <w:pPr>
+        <w:rPr>
+          <w:b/>
+          <w:bCs/>
+          <w:color w:val="0070C0"/>
+          <w:sz w:val="20"/>
+          <w:szCs w:val="20"/>
+        </w:rPr>
+      </w:pPr>
     </w:p>
     <w:p>
       <w:pPr>
@@ -1155,11 +935,6 @@
         </w:rPr>
         <w:t>Feb 2019 – Present</w:t>
       </w:r>
-    </w:p>
-    <w:p>
-      <w:pPr>
-        <w:pStyle w:val="NoSpacing"/>
-      </w:pPr>
     </w:p>
     <w:p>
       <w:pPr>
@@ -1392,7 +1167,21 @@
           <w:sz w:val="20"/>
           <w:szCs w:val="20"/>
         </w:rPr>
-        <w:t xml:space="preserve">, supporting approximately 2,000 orders per day at 99.9% availability and coordinating Sev-1 incidents and critical production issues. </w:t>
+        <w:t>, supporting approximately 2</w:t>
+      </w:r>
+      <w:r>
+        <w:rPr>
+          <w:sz w:val="20"/>
+          <w:szCs w:val="20"/>
+        </w:rPr>
+        <w:t>0</w:t>
+      </w:r>
+      <w:r>
+        <w:rPr>
+          <w:sz w:val="20"/>
+          <w:szCs w:val="20"/>
+        </w:rPr>
+        <w:t xml:space="preserve">,000 orders per day at 99.9% availability and coordinating Sev-1 incidents and critical production issues. </w:t>
       </w:r>
     </w:p>
     <w:p>
@@ -1427,15 +1216,6 @@
     </w:p>
     <w:p>
       <w:pPr>
-        <w:pStyle w:val="NoSpacing"/>
-        <w:rPr>
-          <w:b/>
-          <w:bCs/>
-        </w:rPr>
-      </w:pPr>
-    </w:p>
-    <w:p>
-      <w:pPr>
         <w:rPr>
           <w:b/>
           <w:bCs/>
@@ -1531,10 +1311,10 @@
     </w:p>
     <w:p>
       <w:pPr>
-        <w:pStyle w:val="NoSpacing"/>
+        <w:pStyle w:val="ListParagraph"/>
         <w:numPr>
           <w:ilvl w:val="0"/>
-          <w:numId w:val="4"/>
+          <w:numId w:val="8"/>
         </w:numPr>
         <w:jc w:val="both"/>
         <w:rPr>
@@ -1547,31 +1327,15 @@
           <w:sz w:val="20"/>
           <w:szCs w:val="20"/>
         </w:rPr>
-        <w:t xml:space="preserve">Contributed to </w:t>
-      </w:r>
-      <w:r>
-        <w:rPr>
-          <w:b/>
-          <w:bCs/>
-          <w:sz w:val="20"/>
-          <w:szCs w:val="20"/>
-        </w:rPr>
-        <w:t>Thomson ONE</w:t>
-      </w:r>
-      <w:r>
-        <w:rPr>
-          <w:sz w:val="20"/>
-          <w:szCs w:val="20"/>
-        </w:rPr>
-        <w:t>, an enterprise wealth-management platform supporting major financial institutions.</w:t>
-      </w:r>
-    </w:p>
-    <w:p>
-      <w:pPr>
-        <w:pStyle w:val="NoSpacing"/>
+        <w:t>Contributed to Thomson ONE / BETA, an enterprise wealth-management ecosystem supporting financial institutions and wealth-management operations.</w:t>
+      </w:r>
+    </w:p>
+    <w:p>
+      <w:pPr>
+        <w:pStyle w:val="ListParagraph"/>
         <w:numPr>
           <w:ilvl w:val="0"/>
-          <w:numId w:val="4"/>
+          <w:numId w:val="8"/>
         </w:numPr>
         <w:jc w:val="both"/>
         <w:rPr>
@@ -1584,47 +1348,15 @@
           <w:sz w:val="20"/>
           <w:szCs w:val="20"/>
         </w:rPr>
-        <w:t xml:space="preserve">Played a key role in the </w:t>
-      </w:r>
-      <w:r>
-        <w:rPr>
-          <w:b/>
-          <w:bCs/>
-          <w:sz w:val="20"/>
-          <w:szCs w:val="20"/>
-        </w:rPr>
-        <w:t>BETA Link Refresh</w:t>
-      </w:r>
-      <w:r>
-        <w:rPr>
-          <w:sz w:val="20"/>
-          <w:szCs w:val="20"/>
-        </w:rPr>
-        <w:t xml:space="preserve">, delivering modernized user experiences across </w:t>
-      </w:r>
-      <w:r>
-        <w:rPr>
-          <w:b/>
-          <w:bCs/>
-          <w:sz w:val="20"/>
-          <w:szCs w:val="20"/>
-        </w:rPr>
-        <w:t>Rep, Account, Security, Annuity and Reorg Workbooks</w:t>
-      </w:r>
-      <w:r>
-        <w:rPr>
-          <w:sz w:val="20"/>
-          <w:szCs w:val="20"/>
-        </w:rPr>
-        <w:t>.</w:t>
-      </w:r>
-    </w:p>
-    <w:p>
-      <w:pPr>
-        <w:pStyle w:val="NoSpacing"/>
+        <w:t>Played a key role in BETA Link Refresh, delivering modernized user experiences across Rep, Account, Security, Annuity, and Reorg Workbooks.</w:t>
+      </w:r>
+    </w:p>
+    <w:p>
+      <w:pPr>
+        <w:pStyle w:val="ListParagraph"/>
         <w:numPr>
           <w:ilvl w:val="0"/>
-          <w:numId w:val="4"/>
+          <w:numId w:val="8"/>
         </w:numPr>
         <w:jc w:val="both"/>
         <w:rPr>
@@ -1637,15 +1369,15 @@
           <w:sz w:val="20"/>
           <w:szCs w:val="20"/>
         </w:rPr>
-        <w:t xml:space="preserve">Developed and enhanced enterprise financial applications using C#, ASP.NET, Oracle, WCF, MSMQ, and Silverlight within a multi-tier architecture. </w:t>
-      </w:r>
-    </w:p>
-    <w:p>
-      <w:pPr>
-        <w:pStyle w:val="NoSpacing"/>
+        <w:t>Developed financial applications supporting representatives, clients, accounts, securities, positions, holdings, transactions, transfers, corporate actions, and reporting workflows.</w:t>
+      </w:r>
+    </w:p>
+    <w:p>
+      <w:pPr>
+        <w:pStyle w:val="ListParagraph"/>
         <w:numPr>
           <w:ilvl w:val="0"/>
-          <w:numId w:val="4"/>
+          <w:numId w:val="8"/>
         </w:numPr>
         <w:jc w:val="both"/>
         <w:rPr>
@@ -1658,15 +1390,15 @@
           <w:sz w:val="20"/>
           <w:szCs w:val="20"/>
         </w:rPr>
-        <w:t xml:space="preserve">Reviewed code, mentored developers, and progressively assumed ownership of application modules and release activities. </w:t>
-      </w:r>
-    </w:p>
-    <w:p>
-      <w:pPr>
-        <w:pStyle w:val="NoSpacing"/>
+        <w:t>Developed enterprise applications using C#, ASP.NET, WCF, Oracle, MSMQ, and Silverlight within a multi-tier architecture integrating with backend/mainframe systems.</w:t>
+      </w:r>
+    </w:p>
+    <w:p>
+      <w:pPr>
+        <w:pStyle w:val="ListParagraph"/>
         <w:numPr>
           <w:ilvl w:val="0"/>
-          <w:numId w:val="4"/>
+          <w:numId w:val="8"/>
         </w:numPr>
         <w:jc w:val="both"/>
         <w:rPr>
@@ -1679,15 +1411,15 @@
           <w:sz w:val="20"/>
           <w:szCs w:val="20"/>
         </w:rPr>
-        <w:t xml:space="preserve">Improved application performance by optimizing Crystal Reports and resolving application bottlenecks. </w:t>
-      </w:r>
-    </w:p>
-    <w:p>
-      <w:pPr>
-        <w:pStyle w:val="NoSpacing"/>
+        <w:t>Progressively assumed ownership of application modules and release activities while contributing to design discussions and technical decisions.</w:t>
+      </w:r>
+    </w:p>
+    <w:p>
+      <w:pPr>
+        <w:pStyle w:val="ListParagraph"/>
         <w:numPr>
           <w:ilvl w:val="0"/>
-          <w:numId w:val="4"/>
+          <w:numId w:val="8"/>
         </w:numPr>
         <w:jc w:val="both"/>
         <w:rPr>
@@ -1700,7 +1432,49 @@
           <w:sz w:val="20"/>
           <w:szCs w:val="20"/>
         </w:rPr>
-        <w:t xml:space="preserve">Developed a customization framework that simplified customer-specific product configuration. </w:t>
+        <w:t>Provided code reviews, technical guidance, and mentoring to developers, taking on senior-level responsibilities while remaining hands-on.</w:t>
+      </w:r>
+    </w:p>
+    <w:p>
+      <w:pPr>
+        <w:pStyle w:val="ListParagraph"/>
+        <w:numPr>
+          <w:ilvl w:val="0"/>
+          <w:numId w:val="8"/>
+        </w:numPr>
+        <w:jc w:val="both"/>
+        <w:rPr>
+          <w:sz w:val="20"/>
+          <w:szCs w:val="20"/>
+        </w:rPr>
+      </w:pPr>
+      <w:r>
+        <w:rPr>
+          <w:sz w:val="20"/>
+          <w:szCs w:val="20"/>
+        </w:rPr>
+        <w:t>Developed a customization framework that simplified customer-specific product configuration.</w:t>
+      </w:r>
+    </w:p>
+    <w:p>
+      <w:pPr>
+        <w:pStyle w:val="ListParagraph"/>
+        <w:numPr>
+          <w:ilvl w:val="0"/>
+          <w:numId w:val="8"/>
+        </w:numPr>
+        <w:jc w:val="both"/>
+        <w:rPr>
+          <w:sz w:val="20"/>
+          <w:szCs w:val="20"/>
+        </w:rPr>
+      </w:pPr>
+      <w:r>
+        <w:rPr>
+          <w:sz w:val="20"/>
+          <w:szCs w:val="20"/>
+        </w:rPr>
+        <w:t>Participated in production support, root-cause analysis, defect resolution, and continuous improvement of business-critical wealth-management applications.</w:t>
       </w:r>
     </w:p>
     <w:p>
@@ -1723,6 +1497,7 @@
     </w:p>
     <w:p>
       <w:pPr>
+        <w:spacing w:line="240" w:lineRule="auto"/>
         <w:rPr>
           <w:b/>
           <w:bCs/>
@@ -1918,7 +1693,7 @@
     </w:p>
     <w:sectPr>
       <w:pgSz w:w="11906" w:h="16838"/>
-      <w:pgMar w:top="1134" w:right="1440" w:bottom="851" w:left="1440" w:header="708" w:footer="708" w:gutter="0"/>
+      <w:pgMar w:top="1134" w:right="1440" w:bottom="426" w:left="1440" w:header="708" w:footer="708" w:gutter="0"/>
       <w:cols w:space="708"/>
       <w:docGrid w:linePitch="360"/>
     </w:sectPr>
@@ -2467,6 +2242,345 @@
       <w:rPr>
         <w:rFonts w:ascii="Wingdings" w:hAnsi="Wingdings" w:hint="default"/>
         <w:sz w:val="20"/>
+      </w:rPr>
+    </w:lvl>
+  </w:abstractNum>
+  <w:abstractNum w:abstractNumId="5" w15:restartNumberingAfterBreak="0">
+    <w:nsid w:val="72520F9C"/>
+    <w:multiLevelType w:val="hybridMultilevel"/>
+    <w:tmpl w:val="2C2CF038"/>
+    <w:lvl w:ilvl="0" w:tplc="40090001">
+      <w:start w:val="1"/>
+      <w:numFmt w:val="bullet"/>
+      <w:lvlText w:val=""/>
+      <w:lvlJc w:val="left"/>
+      <w:pPr>
+        <w:ind w:left="720" w:hanging="360"/>
+      </w:pPr>
+      <w:rPr>
+        <w:rFonts w:ascii="Symbol" w:hAnsi="Symbol" w:hint="default"/>
+      </w:rPr>
+    </w:lvl>
+    <w:lvl w:ilvl="1" w:tplc="40090003" w:tentative="1">
+      <w:start w:val="1"/>
+      <w:numFmt w:val="bullet"/>
+      <w:lvlText w:val="o"/>
+      <w:lvlJc w:val="left"/>
+      <w:pPr>
+        <w:ind w:left="1440" w:hanging="360"/>
+      </w:pPr>
+      <w:rPr>
+        <w:rFonts w:ascii="Courier New" w:hAnsi="Courier New" w:cs="Courier New" w:hint="default"/>
+      </w:rPr>
+    </w:lvl>
+    <w:lvl w:ilvl="2" w:tplc="40090005" w:tentative="1">
+      <w:start w:val="1"/>
+      <w:numFmt w:val="bullet"/>
+      <w:lvlText w:val=""/>
+      <w:lvlJc w:val="left"/>
+      <w:pPr>
+        <w:ind w:left="2160" w:hanging="360"/>
+      </w:pPr>
+      <w:rPr>
+        <w:rFonts w:ascii="Wingdings" w:hAnsi="Wingdings" w:hint="default"/>
+      </w:rPr>
+    </w:lvl>
+    <w:lvl w:ilvl="3" w:tplc="40090001" w:tentative="1">
+      <w:start w:val="1"/>
+      <w:numFmt w:val="bullet"/>
+      <w:lvlText w:val=""/>
+      <w:lvlJc w:val="left"/>
+      <w:pPr>
+        <w:ind w:left="2880" w:hanging="360"/>
+      </w:pPr>
+      <w:rPr>
+        <w:rFonts w:ascii="Symbol" w:hAnsi="Symbol" w:hint="default"/>
+      </w:rPr>
+    </w:lvl>
+    <w:lvl w:ilvl="4" w:tplc="40090003" w:tentative="1">
+      <w:start w:val="1"/>
+      <w:numFmt w:val="bullet"/>
+      <w:lvlText w:val="o"/>
+      <w:lvlJc w:val="left"/>
+      <w:pPr>
+        <w:ind w:left="3600" w:hanging="360"/>
+      </w:pPr>
+      <w:rPr>
+        <w:rFonts w:ascii="Courier New" w:hAnsi="Courier New" w:cs="Courier New" w:hint="default"/>
+      </w:rPr>
+    </w:lvl>
+    <w:lvl w:ilvl="5" w:tplc="40090005" w:tentative="1">
+      <w:start w:val="1"/>
+      <w:numFmt w:val="bullet"/>
+      <w:lvlText w:val=""/>
+      <w:lvlJc w:val="left"/>
+      <w:pPr>
+        <w:ind w:left="4320" w:hanging="360"/>
+      </w:pPr>
+      <w:rPr>
+        <w:rFonts w:ascii="Wingdings" w:hAnsi="Wingdings" w:hint="default"/>
+      </w:rPr>
+    </w:lvl>
+    <w:lvl w:ilvl="6" w:tplc="40090001" w:tentative="1">
+      <w:start w:val="1"/>
+      <w:numFmt w:val="bullet"/>
+      <w:lvlText w:val=""/>
+      <w:lvlJc w:val="left"/>
+      <w:pPr>
+        <w:ind w:left="5040" w:hanging="360"/>
+      </w:pPr>
+      <w:rPr>
+        <w:rFonts w:ascii="Symbol" w:hAnsi="Symbol" w:hint="default"/>
+      </w:rPr>
+    </w:lvl>
+    <w:lvl w:ilvl="7" w:tplc="40090003" w:tentative="1">
+      <w:start w:val="1"/>
+      <w:numFmt w:val="bullet"/>
+      <w:lvlText w:val="o"/>
+      <w:lvlJc w:val="left"/>
+      <w:pPr>
+        <w:ind w:left="5760" w:hanging="360"/>
+      </w:pPr>
+      <w:rPr>
+        <w:rFonts w:ascii="Courier New" w:hAnsi="Courier New" w:cs="Courier New" w:hint="default"/>
+      </w:rPr>
+    </w:lvl>
+    <w:lvl w:ilvl="8" w:tplc="40090005" w:tentative="1">
+      <w:start w:val="1"/>
+      <w:numFmt w:val="bullet"/>
+      <w:lvlText w:val=""/>
+      <w:lvlJc w:val="left"/>
+      <w:pPr>
+        <w:ind w:left="6480" w:hanging="360"/>
+      </w:pPr>
+      <w:rPr>
+        <w:rFonts w:ascii="Wingdings" w:hAnsi="Wingdings" w:hint="default"/>
+      </w:rPr>
+    </w:lvl>
+  </w:abstractNum>
+  <w:abstractNum w:abstractNumId="6" w15:restartNumberingAfterBreak="0">
+    <w:nsid w:val="76212142"/>
+    <w:multiLevelType w:val="hybridMultilevel"/>
+    <w:tmpl w:val="755A615A"/>
+    <w:lvl w:ilvl="0" w:tplc="40090001">
+      <w:start w:val="1"/>
+      <w:numFmt w:val="bullet"/>
+      <w:lvlText w:val=""/>
+      <w:lvlJc w:val="left"/>
+      <w:pPr>
+        <w:ind w:left="720" w:hanging="360"/>
+      </w:pPr>
+      <w:rPr>
+        <w:rFonts w:ascii="Symbol" w:hAnsi="Symbol" w:hint="default"/>
+      </w:rPr>
+    </w:lvl>
+    <w:lvl w:ilvl="1" w:tplc="40090003" w:tentative="1">
+      <w:start w:val="1"/>
+      <w:numFmt w:val="bullet"/>
+      <w:lvlText w:val="o"/>
+      <w:lvlJc w:val="left"/>
+      <w:pPr>
+        <w:ind w:left="1440" w:hanging="360"/>
+      </w:pPr>
+      <w:rPr>
+        <w:rFonts w:ascii="Courier New" w:hAnsi="Courier New" w:cs="Courier New" w:hint="default"/>
+      </w:rPr>
+    </w:lvl>
+    <w:lvl w:ilvl="2" w:tplc="40090005" w:tentative="1">
+      <w:start w:val="1"/>
+      <w:numFmt w:val="bullet"/>
+      <w:lvlText w:val=""/>
+      <w:lvlJc w:val="left"/>
+      <w:pPr>
+        <w:ind w:left="2160" w:hanging="360"/>
+      </w:pPr>
+      <w:rPr>
+        <w:rFonts w:ascii="Wingdings" w:hAnsi="Wingdings" w:hint="default"/>
+      </w:rPr>
+    </w:lvl>
+    <w:lvl w:ilvl="3" w:tplc="40090001" w:tentative="1">
+      <w:start w:val="1"/>
+      <w:numFmt w:val="bullet"/>
+      <w:lvlText w:val=""/>
+      <w:lvlJc w:val="left"/>
+      <w:pPr>
+        <w:ind w:left="2880" w:hanging="360"/>
+      </w:pPr>
+      <w:rPr>
+        <w:rFonts w:ascii="Symbol" w:hAnsi="Symbol" w:hint="default"/>
+      </w:rPr>
+    </w:lvl>
+    <w:lvl w:ilvl="4" w:tplc="40090003" w:tentative="1">
+      <w:start w:val="1"/>
+      <w:numFmt w:val="bullet"/>
+      <w:lvlText w:val="o"/>
+      <w:lvlJc w:val="left"/>
+      <w:pPr>
+        <w:ind w:left="3600" w:hanging="360"/>
+      </w:pPr>
+      <w:rPr>
+        <w:rFonts w:ascii="Courier New" w:hAnsi="Courier New" w:cs="Courier New" w:hint="default"/>
+      </w:rPr>
+    </w:lvl>
+    <w:lvl w:ilvl="5" w:tplc="40090005" w:tentative="1">
+      <w:start w:val="1"/>
+      <w:numFmt w:val="bullet"/>
+      <w:lvlText w:val=""/>
+      <w:lvlJc w:val="left"/>
+      <w:pPr>
+        <w:ind w:left="4320" w:hanging="360"/>
+      </w:pPr>
+      <w:rPr>
+        <w:rFonts w:ascii="Wingdings" w:hAnsi="Wingdings" w:hint="default"/>
+      </w:rPr>
+    </w:lvl>
+    <w:lvl w:ilvl="6" w:tplc="40090001" w:tentative="1">
+      <w:start w:val="1"/>
+      <w:numFmt w:val="bullet"/>
+      <w:lvlText w:val=""/>
+      <w:lvlJc w:val="left"/>
+      <w:pPr>
+        <w:ind w:left="5040" w:hanging="360"/>
+      </w:pPr>
+      <w:rPr>
+        <w:rFonts w:ascii="Symbol" w:hAnsi="Symbol" w:hint="default"/>
+      </w:rPr>
+    </w:lvl>
+    <w:lvl w:ilvl="7" w:tplc="40090003" w:tentative="1">
+      <w:start w:val="1"/>
+      <w:numFmt w:val="bullet"/>
+      <w:lvlText w:val="o"/>
+      <w:lvlJc w:val="left"/>
+      <w:pPr>
+        <w:ind w:left="5760" w:hanging="360"/>
+      </w:pPr>
+      <w:rPr>
+        <w:rFonts w:ascii="Courier New" w:hAnsi="Courier New" w:cs="Courier New" w:hint="default"/>
+      </w:rPr>
+    </w:lvl>
+    <w:lvl w:ilvl="8" w:tplc="40090005" w:tentative="1">
+      <w:start w:val="1"/>
+      <w:numFmt w:val="bullet"/>
+      <w:lvlText w:val=""/>
+      <w:lvlJc w:val="left"/>
+      <w:pPr>
+        <w:ind w:left="6480" w:hanging="360"/>
+      </w:pPr>
+      <w:rPr>
+        <w:rFonts w:ascii="Wingdings" w:hAnsi="Wingdings" w:hint="default"/>
+      </w:rPr>
+    </w:lvl>
+  </w:abstractNum>
+  <w:abstractNum w:abstractNumId="7" w15:restartNumberingAfterBreak="0">
+    <w:nsid w:val="7DBB37A5"/>
+    <w:multiLevelType w:val="hybridMultilevel"/>
+    <w:tmpl w:val="C1AA323C"/>
+    <w:lvl w:ilvl="0" w:tplc="40090001">
+      <w:start w:val="1"/>
+      <w:numFmt w:val="bullet"/>
+      <w:lvlText w:val=""/>
+      <w:lvlJc w:val="left"/>
+      <w:pPr>
+        <w:ind w:left="720" w:hanging="360"/>
+      </w:pPr>
+      <w:rPr>
+        <w:rFonts w:ascii="Symbol" w:hAnsi="Symbol" w:hint="default"/>
+      </w:rPr>
+    </w:lvl>
+    <w:lvl w:ilvl="1" w:tplc="40090003" w:tentative="1">
+      <w:start w:val="1"/>
+      <w:numFmt w:val="bullet"/>
+      <w:lvlText w:val="o"/>
+      <w:lvlJc w:val="left"/>
+      <w:pPr>
+        <w:ind w:left="1440" w:hanging="360"/>
+      </w:pPr>
+      <w:rPr>
+        <w:rFonts w:ascii="Courier New" w:hAnsi="Courier New" w:cs="Courier New" w:hint="default"/>
+      </w:rPr>
+    </w:lvl>
+    <w:lvl w:ilvl="2" w:tplc="40090005" w:tentative="1">
+      <w:start w:val="1"/>
+      <w:numFmt w:val="bullet"/>
+      <w:lvlText w:val=""/>
+      <w:lvlJc w:val="left"/>
+      <w:pPr>
+        <w:ind w:left="2160" w:hanging="360"/>
+      </w:pPr>
+      <w:rPr>
+        <w:rFonts w:ascii="Wingdings" w:hAnsi="Wingdings" w:hint="default"/>
+      </w:rPr>
+    </w:lvl>
+    <w:lvl w:ilvl="3" w:tplc="40090001" w:tentative="1">
+      <w:start w:val="1"/>
+      <w:numFmt w:val="bullet"/>
+      <w:lvlText w:val=""/>
+      <w:lvlJc w:val="left"/>
+      <w:pPr>
+        <w:ind w:left="2880" w:hanging="360"/>
+      </w:pPr>
+      <w:rPr>
+        <w:rFonts w:ascii="Symbol" w:hAnsi="Symbol" w:hint="default"/>
+      </w:rPr>
+    </w:lvl>
+    <w:lvl w:ilvl="4" w:tplc="40090003" w:tentative="1">
+      <w:start w:val="1"/>
+      <w:numFmt w:val="bullet"/>
+      <w:lvlText w:val="o"/>
+      <w:lvlJc w:val="left"/>
+      <w:pPr>
+        <w:ind w:left="3600" w:hanging="360"/>
+      </w:pPr>
+      <w:rPr>
+        <w:rFonts w:ascii="Courier New" w:hAnsi="Courier New" w:cs="Courier New" w:hint="default"/>
+      </w:rPr>
+    </w:lvl>
+    <w:lvl w:ilvl="5" w:tplc="40090005" w:tentative="1">
+      <w:start w:val="1"/>
+      <w:numFmt w:val="bullet"/>
+      <w:lvlText w:val=""/>
+      <w:lvlJc w:val="left"/>
+      <w:pPr>
+        <w:ind w:left="4320" w:hanging="360"/>
+      </w:pPr>
+      <w:rPr>
+        <w:rFonts w:ascii="Wingdings" w:hAnsi="Wingdings" w:hint="default"/>
+      </w:rPr>
+    </w:lvl>
+    <w:lvl w:ilvl="6" w:tplc="40090001" w:tentative="1">
+      <w:start w:val="1"/>
+      <w:numFmt w:val="bullet"/>
+      <w:lvlText w:val=""/>
+      <w:lvlJc w:val="left"/>
+      <w:pPr>
+        <w:ind w:left="5040" w:hanging="360"/>
+      </w:pPr>
+      <w:rPr>
+        <w:rFonts w:ascii="Symbol" w:hAnsi="Symbol" w:hint="default"/>
+      </w:rPr>
+    </w:lvl>
+    <w:lvl w:ilvl="7" w:tplc="40090003" w:tentative="1">
+      <w:start w:val="1"/>
+      <w:numFmt w:val="bullet"/>
+      <w:lvlText w:val="o"/>
+      <w:lvlJc w:val="left"/>
+      <w:pPr>
+        <w:ind w:left="5760" w:hanging="360"/>
+      </w:pPr>
+      <w:rPr>
+        <w:rFonts w:ascii="Courier New" w:hAnsi="Courier New" w:cs="Courier New" w:hint="default"/>
+      </w:rPr>
+    </w:lvl>
+    <w:lvl w:ilvl="8" w:tplc="40090005" w:tentative="1">
+      <w:start w:val="1"/>
+      <w:numFmt w:val="bullet"/>
+      <w:lvlText w:val=""/>
+      <w:lvlJc w:val="left"/>
+      <w:pPr>
+        <w:ind w:left="6480" w:hanging="360"/>
+      </w:pPr>
+      <w:rPr>
+        <w:rFonts w:ascii="Wingdings" w:hAnsi="Wingdings" w:hint="default"/>
       </w:rPr>
     </w:lvl>
   </w:abstractNum>
@@ -2484,6 +2598,15 @@
   </w:num>
   <w:num w:numId="5" w16cid:durableId="672293965">
     <w:abstractNumId w:val="3"/>
+  </w:num>
+  <w:num w:numId="6" w16cid:durableId="1342781729">
+    <w:abstractNumId w:val="6"/>
+  </w:num>
+  <w:num w:numId="7" w16cid:durableId="231742381">
+    <w:abstractNumId w:val="7"/>
+  </w:num>
+  <w:num w:numId="8" w16cid:durableId="783618208">
+    <w:abstractNumId w:val="5"/>
   </w:num>
   <w:numIdMacAtCleanup w:val="5"/>
 </w:numbering>

</xml_diff>